<commit_message>
ch6 cites and test for new remote
</commit_message>
<xml_diff>
--- a/draft/ch6-draft.docx
+++ b/draft/ch6-draft.docx
@@ -1,6 +1,6 @@
 
 <file path=word/document.xml><?xml version="1.0" encoding="utf-8"?>
-<w:document xmlns:o="urn:schemas-microsoft-com:office:office" xmlns:r="http://schemas.openxmlformats.org/officeDocument/2006/relationships" xmlns:v="urn:schemas-microsoft-com:vml" xmlns:w="http://schemas.openxmlformats.org/wordprocessingml/2006/main" xmlns:w10="urn:schemas-microsoft-com:office:word" xmlns:wp="http://schemas.openxmlformats.org/drawingml/2006/wordprocessingDrawing" xmlns:wps="http://schemas.microsoft.com/office/word/2010/wordprocessingShape" xmlns:wpg="http://schemas.microsoft.com/office/word/2010/wordprocessingGroup" xmlns:mc="http://schemas.openxmlformats.org/markup-compatibility/2006" xmlns:wp14="http://schemas.microsoft.com/office/word/2010/wordprocessingDrawing" xmlns:w14="http://schemas.microsoft.com/office/word/2010/wordml" xmlns:w15="http://schemas.microsoft.com/office/word/2012/wordml" mc:Ignorable="w14 wp14 w15">
+<w:document xmlns:o="urn:schemas-microsoft-com:office:office" xmlns:r="http://schemas.openxmlformats.org/officeDocument/2006/relationships" xmlns:v="urn:schemas-microsoft-com:vml" xmlns:w="http://schemas.openxmlformats.org/wordprocessingml/2006/main" xmlns:w10="urn:schemas-microsoft-com:office:word" xmlns:wp="http://schemas.openxmlformats.org/drawingml/2006/wordprocessingDrawing" xmlns:pic="http://schemas.openxmlformats.org/drawingml/2006/picture" xmlns:wps="http://schemas.microsoft.com/office/word/2010/wordprocessingShape" xmlns:wpg="http://schemas.microsoft.com/office/word/2010/wordprocessingGroup" xmlns:mc="http://schemas.openxmlformats.org/markup-compatibility/2006" xmlns:wp14="http://schemas.microsoft.com/office/word/2010/wordprocessingDrawing" xmlns:w14="http://schemas.microsoft.com/office/word/2010/wordml" xmlns:w15="http://schemas.microsoft.com/office/word/2012/wordml" mc:Ignorable="w14 wp14 w15">
   <w:body>
     <w:p>
       <w:pPr>
@@ -100,7 +100,217 @@
           <w:u w:val="none"/>
           <w:lang w:val="en-US"/>
         </w:rPr>
-        <w:t>—Gor’kii, “Untimely Thoughts,” (1917)</w:t>
+        <w:t xml:space="preserve">—Gor’kii, </w:t>
+      </w:r>
+      <w:r>
+        <w:rPr>
+          <w:rFonts w:eastAsia="Times New Roman" w:cs="Times New Roman" w:ascii="Times New Roman" w:hAnsi="Times New Roman"/>
+          <w:b w:val="false"/>
+          <w:bCs w:val="false"/>
+          <w:i w:val="false"/>
+          <w:iCs w:val="false"/>
+          <w:sz w:val="24"/>
+          <w:szCs w:val="24"/>
+          <w:u w:val="none"/>
+          <w:lang w:val="en-US"/>
+        </w:rPr>
+        <w:t>o</w:t>
+      </w:r>
+      <w:r>
+        <w:rPr>
+          <w:rFonts w:eastAsia="Times New Roman" w:cs="Times New Roman" w:ascii="Times New Roman" w:hAnsi="Times New Roman"/>
+          <w:b w:val="false"/>
+          <w:bCs w:val="false"/>
+          <w:i w:val="false"/>
+          <w:iCs w:val="false"/>
+          <w:sz w:val="24"/>
+          <w:szCs w:val="24"/>
+          <w:u w:val="none"/>
+          <w:lang w:val="en-US"/>
+        </w:rPr>
+        <w:t>p</w:t>
+      </w:r>
+      <w:r>
+        <w:rPr>
+          <w:rFonts w:eastAsia="Times New Roman" w:cs="Times New Roman" w:ascii="Times New Roman" w:hAnsi="Times New Roman"/>
+          <w:b w:val="false"/>
+          <w:bCs w:val="false"/>
+          <w:i w:val="false"/>
+          <w:iCs w:val="false"/>
+          <w:sz w:val="24"/>
+          <w:szCs w:val="24"/>
+          <w:u w:val="none"/>
+          <w:lang w:val="en-US"/>
+        </w:rPr>
+        <w:t>e</w:t>
+      </w:r>
+      <w:r>
+        <w:rPr>
+          <w:rFonts w:eastAsia="Times New Roman" w:cs="Times New Roman" w:ascii="Times New Roman" w:hAnsi="Times New Roman"/>
+          <w:b w:val="false"/>
+          <w:bCs w:val="false"/>
+          <w:i w:val="false"/>
+          <w:iCs w:val="false"/>
+          <w:sz w:val="24"/>
+          <w:szCs w:val="24"/>
+          <w:u w:val="none"/>
+          <w:lang w:val="en-US"/>
+        </w:rPr>
+        <w:t>n</w:t>
+      </w:r>
+      <w:r>
+        <w:rPr>
+          <w:rFonts w:eastAsia="Times New Roman" w:cs="Times New Roman" w:ascii="Times New Roman" w:hAnsi="Times New Roman"/>
+          <w:b w:val="false"/>
+          <w:bCs w:val="false"/>
+          <w:i w:val="false"/>
+          <w:iCs w:val="false"/>
+          <w:sz w:val="24"/>
+          <w:szCs w:val="24"/>
+          <w:u w:val="none"/>
+          <w:lang w:val="en-US"/>
+        </w:rPr>
+        <w:t>i</w:t>
+      </w:r>
+      <w:r>
+        <w:rPr>
+          <w:rFonts w:eastAsia="Times New Roman" w:cs="Times New Roman" w:ascii="Times New Roman" w:hAnsi="Times New Roman"/>
+          <w:b w:val="false"/>
+          <w:bCs w:val="false"/>
+          <w:i w:val="false"/>
+          <w:iCs w:val="false"/>
+          <w:sz w:val="24"/>
+          <w:szCs w:val="24"/>
+          <w:u w:val="none"/>
+          <w:lang w:val="en-US"/>
+        </w:rPr>
+        <w:t>n</w:t>
+      </w:r>
+      <w:r>
+        <w:rPr>
+          <w:rFonts w:eastAsia="Times New Roman" w:cs="Times New Roman" w:ascii="Times New Roman" w:hAnsi="Times New Roman"/>
+          <w:b w:val="false"/>
+          <w:bCs w:val="false"/>
+          <w:i w:val="false"/>
+          <w:iCs w:val="false"/>
+          <w:sz w:val="24"/>
+          <w:szCs w:val="24"/>
+          <w:u w:val="none"/>
+          <w:lang w:val="en-US"/>
+        </w:rPr>
+        <w:t xml:space="preserve">g </w:t>
+      </w:r>
+      <w:r>
+        <w:rPr>
+          <w:rFonts w:eastAsia="Times New Roman" w:cs="Times New Roman" w:ascii="Times New Roman" w:hAnsi="Times New Roman"/>
+          <w:b w:val="false"/>
+          <w:bCs w:val="false"/>
+          <w:i w:val="false"/>
+          <w:iCs w:val="false"/>
+          <w:sz w:val="24"/>
+          <w:szCs w:val="24"/>
+          <w:u w:val="none"/>
+          <w:lang w:val="en-US"/>
+        </w:rPr>
+        <w:t>w</w:t>
+      </w:r>
+      <w:r>
+        <w:rPr>
+          <w:rFonts w:eastAsia="Times New Roman" w:cs="Times New Roman" w:ascii="Times New Roman" w:hAnsi="Times New Roman"/>
+          <w:b w:val="false"/>
+          <w:bCs w:val="false"/>
+          <w:i w:val="false"/>
+          <w:iCs w:val="false"/>
+          <w:sz w:val="24"/>
+          <w:szCs w:val="24"/>
+          <w:u w:val="none"/>
+          <w:lang w:val="en-US"/>
+        </w:rPr>
+        <w:t>o</w:t>
+      </w:r>
+      <w:r>
+        <w:rPr>
+          <w:rFonts w:eastAsia="Times New Roman" w:cs="Times New Roman" w:ascii="Times New Roman" w:hAnsi="Times New Roman"/>
+          <w:b w:val="false"/>
+          <w:bCs w:val="false"/>
+          <w:i w:val="false"/>
+          <w:iCs w:val="false"/>
+          <w:sz w:val="24"/>
+          <w:szCs w:val="24"/>
+          <w:u w:val="none"/>
+          <w:lang w:val="en-US"/>
+        </w:rPr>
+        <w:t>r</w:t>
+      </w:r>
+      <w:r>
+        <w:rPr>
+          <w:rFonts w:eastAsia="Times New Roman" w:cs="Times New Roman" w:ascii="Times New Roman" w:hAnsi="Times New Roman"/>
+          <w:b w:val="false"/>
+          <w:bCs w:val="false"/>
+          <w:i w:val="false"/>
+          <w:iCs w:val="false"/>
+          <w:sz w:val="24"/>
+          <w:szCs w:val="24"/>
+          <w:u w:val="none"/>
+          <w:lang w:val="en-US"/>
+        </w:rPr>
+        <w:t>d</w:t>
+      </w:r>
+      <w:r>
+        <w:rPr>
+          <w:rFonts w:eastAsia="Times New Roman" w:cs="Times New Roman" w:ascii="Times New Roman" w:hAnsi="Times New Roman"/>
+          <w:b w:val="false"/>
+          <w:bCs w:val="false"/>
+          <w:i w:val="false"/>
+          <w:iCs w:val="false"/>
+          <w:sz w:val="24"/>
+          <w:szCs w:val="24"/>
+          <w:u w:val="none"/>
+          <w:lang w:val="en-US"/>
+        </w:rPr>
+        <w:t xml:space="preserve">s </w:t>
+      </w:r>
+      <w:r>
+        <w:rPr>
+          <w:rFonts w:eastAsia="Times New Roman" w:cs="Times New Roman" w:ascii="Times New Roman" w:hAnsi="Times New Roman"/>
+          <w:b w:val="false"/>
+          <w:bCs w:val="false"/>
+          <w:i w:val="false"/>
+          <w:iCs w:val="false"/>
+          <w:sz w:val="24"/>
+          <w:szCs w:val="24"/>
+          <w:u w:val="none"/>
+          <w:lang w:val="en-US"/>
+        </w:rPr>
+        <w:t>o</w:t>
+      </w:r>
+      <w:r>
+        <w:rPr>
+          <w:rFonts w:eastAsia="Times New Roman" w:cs="Times New Roman" w:ascii="Times New Roman" w:hAnsi="Times New Roman"/>
+          <w:b w:val="false"/>
+          <w:bCs w:val="false"/>
+          <w:i w:val="false"/>
+          <w:iCs w:val="false"/>
+          <w:sz w:val="24"/>
+          <w:szCs w:val="24"/>
+          <w:u w:val="none"/>
+          <w:lang w:val="en-US"/>
+        </w:rPr>
+        <w:t xml:space="preserve">f </w:t>
+      </w:r>
+      <w:r>
+        <w:rPr>
+          <w:rFonts w:eastAsia="Times New Roman" w:cs="Times New Roman" w:ascii="Times New Roman" w:hAnsi="Times New Roman"/>
+          <w:b w:val="false"/>
+          <w:bCs w:val="false"/>
+          <w:i w:val="false"/>
+          <w:iCs w:val="false"/>
+          <w:sz w:val="24"/>
+          <w:szCs w:val="24"/>
+          <w:u w:val="none"/>
+          <w:lang w:val="en-US"/>
+        </w:rPr>
+        <w:t>“Untimely Thoughts,” (1917)</w:t>
       </w:r>
       <w:r>
         <w:rPr>
@@ -968,12 +1178,12 @@
 </file>
 
 <file path=word/comments.xml><?xml version="1.0" encoding="utf-8"?>
-<w:comments xmlns:o="urn:schemas-microsoft-com:office:office" xmlns:r="http://schemas.openxmlformats.org/officeDocument/2006/relationships" xmlns:v="urn:schemas-microsoft-com:vml" xmlns:w="http://schemas.openxmlformats.org/wordprocessingml/2006/main" xmlns:w10="urn:schemas-microsoft-com:office:word" xmlns:wp="http://schemas.openxmlformats.org/drawingml/2006/wordprocessingDrawing" xmlns:wps="http://schemas.microsoft.com/office/word/2010/wordprocessingShape" xmlns:wpg="http://schemas.microsoft.com/office/word/2010/wordprocessingGroup" xmlns:mc="http://schemas.openxmlformats.org/markup-compatibility/2006" xmlns:wp14="http://schemas.microsoft.com/office/word/2010/wordprocessingDrawing" xmlns:w14="http://schemas.microsoft.com/office/word/2010/wordml" xmlns:w15="http://schemas.microsoft.com/office/word/2012/wordml" mc:Ignorable="w14 wp14 w15">
+<w:comments xmlns:o="urn:schemas-microsoft-com:office:office" xmlns:r="http://schemas.openxmlformats.org/officeDocument/2006/relationships" xmlns:v="urn:schemas-microsoft-com:vml" xmlns:w="http://schemas.openxmlformats.org/wordprocessingml/2006/main" xmlns:w10="urn:schemas-microsoft-com:office:word" xmlns:wp="http://schemas.openxmlformats.org/drawingml/2006/wordprocessingDrawing" xmlns:pic="http://schemas.openxmlformats.org/drawingml/2006/picture" xmlns:wps="http://schemas.microsoft.com/office/word/2010/wordprocessingShape" xmlns:wpg="http://schemas.microsoft.com/office/word/2010/wordprocessingGroup" xmlns:mc="http://schemas.openxmlformats.org/markup-compatibility/2006" xmlns:wp14="http://schemas.microsoft.com/office/word/2010/wordprocessingDrawing" xmlns:w14="http://schemas.microsoft.com/office/word/2010/wordml" xmlns:w15="http://schemas.microsoft.com/office/word/2012/wordml" mc:Ignorable="w14 wp14 w15">
   <w:comment w:id="0" w:author="Clowes, Edith W (eec3c)" w:date="2024-09-15T11:42:22Z" w:initials="C(">
     <w:p>
       <w:pPr>
-        <w:overflowPunct w:val="true"/>
-        <w:spacing w:before="0" w:after="0" w:lineRule="auto" w:line="240"/>
+        <w:overflowPunct w:val="false"/>
+        <w:spacing w:lineRule="auto" w:line="240" w:before="0" w:after="0"/>
         <w:rPr/>
       </w:pPr>
       <w:r>
@@ -990,8 +1200,8 @@
   <w:comment w:id="1" w:author="Clowes, Edith W (eec3c)" w:date="2024-08-04T13:52:31Z" w:initials="C(">
     <w:p>
       <w:pPr>
-        <w:overflowPunct w:val="true"/>
-        <w:spacing w:before="0" w:after="0" w:lineRule="auto" w:line="240"/>
+        <w:overflowPunct w:val="false"/>
+        <w:spacing w:lineRule="auto" w:line="240" w:before="0" w:after="0"/>
         <w:rPr/>
       </w:pPr>
       <w:r>
@@ -1009,7 +1219,7 @@
 </file>
 
 <file path=word/footnotes.xml><?xml version="1.0" encoding="utf-8"?>
-<w:footnotes xmlns:o="urn:schemas-microsoft-com:office:office" xmlns:r="http://schemas.openxmlformats.org/officeDocument/2006/relationships" xmlns:v="urn:schemas-microsoft-com:vml" xmlns:w="http://schemas.openxmlformats.org/wordprocessingml/2006/main" xmlns:w10="urn:schemas-microsoft-com:office:word" xmlns:wp="http://schemas.openxmlformats.org/drawingml/2006/wordprocessingDrawing" xmlns:wps="http://schemas.microsoft.com/office/word/2010/wordprocessingShape" xmlns:wpg="http://schemas.microsoft.com/office/word/2010/wordprocessingGroup" xmlns:mc="http://schemas.openxmlformats.org/markup-compatibility/2006" xmlns:wp14="http://schemas.microsoft.com/office/word/2010/wordprocessingDrawing" xmlns:w14="http://schemas.microsoft.com/office/word/2010/wordml" xmlns:w15="http://schemas.microsoft.com/office/word/2012/wordml" mc:Ignorable="w14 wp14 w15">
+<w:footnotes xmlns:o="urn:schemas-microsoft-com:office:office" xmlns:r="http://schemas.openxmlformats.org/officeDocument/2006/relationships" xmlns:v="urn:schemas-microsoft-com:vml" xmlns:w="http://schemas.openxmlformats.org/wordprocessingml/2006/main" xmlns:w10="urn:schemas-microsoft-com:office:word" xmlns:wp="http://schemas.openxmlformats.org/drawingml/2006/wordprocessingDrawing" xmlns:pic="http://schemas.openxmlformats.org/drawingml/2006/picture" xmlns:wps="http://schemas.microsoft.com/office/word/2010/wordprocessingShape" xmlns:wpg="http://schemas.microsoft.com/office/word/2010/wordprocessingGroup" xmlns:mc="http://schemas.openxmlformats.org/markup-compatibility/2006" xmlns:wp14="http://schemas.microsoft.com/office/word/2010/wordprocessingDrawing" xmlns:w14="http://schemas.microsoft.com/office/word/2010/wordml" xmlns:w15="http://schemas.microsoft.com/office/word/2012/wordml" mc:Ignorable="w14 wp14 w15">
   <w:footnote w:id="0" w:type="separator">
     <w:p>
       <w:r>
@@ -1043,13 +1253,97 @@
         <w:rPr>
           <w:rFonts w:ascii="Liberation Serif" w:hAnsi="Liberation Serif"/>
         </w:rPr>
-        <w:t xml:space="preserve"> “</w:t>
-      </w:r>
-      <w:r>
-        <w:rPr>
-          <w:rFonts w:ascii="Liberation Serif" w:hAnsi="Liberation Serif"/>
-        </w:rPr>
-        <w:t>Подарок всех подарков - правда. ... Теперь босяки обуты, теперь приват-доценты обездолены. Стало ли лучше в России? Из-под голубого каприйского неба на русскую почву перенесенные ростки социал-демократической школы, с ректором Горьким во главе, так ли взошли, как об этом мечтал добросовестный садовник?..”</w:t>
+        <w:t xml:space="preserve"> </w:t>
+      </w:r>
+      <w:r>
+        <w:rPr>
+          <w:rFonts w:ascii="Liberation Serif" w:hAnsi="Liberation Serif"/>
+        </w:rPr>
+        <w:t>Maksim Gorʹki</w:t>
+      </w:r>
+      <w:r>
+        <w:rPr>
+          <w:rFonts w:ascii="Liberation Serif" w:hAnsi="Liberation Serif"/>
+        </w:rPr>
+        <w:t>i</w:t>
+      </w:r>
+      <w:r>
+        <w:rPr>
+          <w:rFonts w:ascii="Liberation Serif" w:hAnsi="Liberation Serif"/>
+        </w:rPr>
+        <w:t>, Nesvoevremenn</w:t>
+      </w:r>
+      <w:r>
+        <w:rPr>
+          <w:rFonts w:ascii="Liberation Serif" w:hAnsi="Liberation Serif"/>
+        </w:rPr>
+        <w:t>ai</w:t>
+      </w:r>
+      <w:r>
+        <w:rPr>
+          <w:rFonts w:ascii="Liberation Serif" w:hAnsi="Liberation Serif"/>
+        </w:rPr>
+        <w:t xml:space="preserve">a </w:t>
+      </w:r>
+      <w:r>
+        <w:rPr>
+          <w:rFonts w:ascii="Liberation Serif" w:hAnsi="Liberation Serif"/>
+        </w:rPr>
+        <w:t>m</w:t>
+      </w:r>
+      <w:r>
+        <w:rPr>
+          <w:rFonts w:ascii="Liberation Serif" w:hAnsi="Liberation Serif"/>
+        </w:rPr>
+        <w:t xml:space="preserve">ysli: Zametki o </w:t>
+      </w:r>
+      <w:r>
+        <w:rPr>
+          <w:rFonts w:ascii="Liberation Serif" w:hAnsi="Liberation Serif"/>
+        </w:rPr>
+        <w:t>r</w:t>
+      </w:r>
+      <w:r>
+        <w:rPr>
+          <w:rFonts w:ascii="Liberation Serif" w:hAnsi="Liberation Serif"/>
+        </w:rPr>
+        <w:t xml:space="preserve">evoijucii i </w:t>
+      </w:r>
+      <w:r>
+        <w:rPr>
+          <w:rFonts w:ascii="Liberation Serif" w:hAnsi="Liberation Serif"/>
+        </w:rPr>
+        <w:t>k</w:t>
+      </w:r>
+      <w:r>
+        <w:rPr>
+          <w:rFonts w:ascii="Liberation Serif" w:hAnsi="Liberation Serif"/>
+        </w:rPr>
+        <w:t>ul’ture, ed. Iosif Irmovič Vajnberg (Sovetski</w:t>
+      </w:r>
+      <w:r>
+        <w:rPr>
+          <w:rFonts w:ascii="Liberation Serif" w:hAnsi="Liberation Serif"/>
+        </w:rPr>
+        <w:t>i</w:t>
+      </w:r>
+      <w:r>
+        <w:rPr>
+          <w:rFonts w:ascii="Liberation Serif" w:hAnsi="Liberation Serif"/>
+        </w:rPr>
+        <w:t xml:space="preserve"> pisatel’, 1990), </w:t>
+      </w:r>
+      <w:r>
+        <w:rPr>
+          <w:rFonts w:ascii="Liberation Serif" w:hAnsi="Liberation Serif"/>
+        </w:rPr>
+        <w:t>76.</w:t>
+      </w:r>
+      <w:r>
+        <w:rPr>
+          <w:rFonts w:ascii="Liberation Serif" w:hAnsi="Liberation Serif"/>
+        </w:rPr>
+        <w:t xml:space="preserve"> “Русский народ обвенчался со Свободой. Будем верить, что от этого союза в нашей стране, измученной и физически, и духовно, родятся новые сильные люди. Будем крепко верить, что в русском человеке разгорятся ярким огнем силы его разума и воли, силы, погашенные и подавленные вековым гнетом полицейского строя жизни. Но нам не следует забывать, что все мы — люди вчерашнего дня и что великое дело возрождения страны в руках людей, воспитанных тяжкими впечатлениями прошлого в духе недоверия друг к другу, неуважения к ближнему и уродливого эгоизма.” </w:t>
       </w:r>
     </w:p>
   </w:footnote>
@@ -1067,8 +1361,41 @@
         <w:footnoteRef/>
       </w:r>
       <w:r>
-        <w:rPr/>
+        <w:rPr>
+          <w:rFonts w:ascii="Liberation Serif" w:hAnsi="Liberation Serif"/>
+        </w:rPr>
         <w:t xml:space="preserve"> </w:t>
+      </w:r>
+      <w:r>
+        <w:rPr>
+          <w:rFonts w:ascii="Liberation Serif" w:hAnsi="Liberation Serif"/>
+        </w:rPr>
+        <w:t xml:space="preserve">Iulii Isaevich Aikhenval’d, </w:t>
+      </w:r>
+      <w:r>
+        <w:rPr>
+          <w:rFonts w:ascii="Liberation Serif" w:hAnsi="Liberation Serif"/>
+          <w:i/>
+        </w:rPr>
+        <w:t>Siluety Russkikh pisatelei: Noveishaia literatura</w:t>
+      </w:r>
+      <w:r>
+        <w:rPr>
+          <w:rFonts w:ascii="Liberation Serif" w:hAnsi="Liberation Serif"/>
+        </w:rPr>
+        <w:t xml:space="preserve">, 4th ed., vol. 3 (Berlin: Slovo, 1923), </w:t>
+      </w:r>
+      <w:r>
+        <w:rPr>
+          <w:rFonts w:ascii="Liberation Serif" w:hAnsi="Liberation Serif"/>
+        </w:rPr>
+        <w:t xml:space="preserve">233. </w:t>
+      </w:r>
+      <w:r>
+        <w:rPr>
+          <w:rFonts w:ascii="Liberation Serif" w:hAnsi="Liberation Serif"/>
+        </w:rPr>
+        <w:t>“Подарок всех подарков - правда. ... Теперь босяки обуты, теперь приват-доценты обездолены. Стало ли лучше в России? Из-под голубого каприйского неба на русскую почву перенесенные ростки социал-демократической школы, с ректором Горьким во главе, так ли взошли, как об этом мечтал добросовестный садовник?..”</w:t>
       </w:r>
     </w:p>
   </w:footnote>
@@ -1212,7 +1539,7 @@
     <w:pPr>
       <w:widowControl/>
       <w:suppressAutoHyphens w:val="true"/>
-      <w:overflowPunct w:val="false"/>
+      <w:overflowPunct w:val="true"/>
       <w:bidi w:val="0"/>
       <w:spacing w:lineRule="auto" w:line="259" w:before="0" w:after="160"/>
       <w:jc w:val="left"/>
@@ -1230,6 +1557,13 @@
     <w:name w:val="Default Paragraph Font"/>
     <w:qFormat/>
     <w:rPr/>
+  </w:style>
+  <w:style w:type="character" w:styleId="FootnoteCharactersuser">
+    <w:name w:val="Footnote Characters (user)"/>
+    <w:qFormat/>
+    <w:rPr>
+      <w:vertAlign w:val="superscript"/>
+    </w:rPr>
   </w:style>
   <w:style w:type="character" w:styleId="FootnoteCharacters">
     <w:name w:val="Footnote Characters"/>
@@ -1254,15 +1588,29 @@
       <w:szCs w:val="20"/>
     </w:rPr>
   </w:style>
+  <w:style w:type="character" w:styleId="EndnoteCharactersuser">
+    <w:name w:val="Endnote Characters (user)"/>
+    <w:qFormat/>
+    <w:rPr/>
+  </w:style>
   <w:style w:type="character" w:styleId="EndnoteCharacters">
     <w:name w:val="Endnote Characters"/>
     <w:qFormat/>
-    <w:rPr/>
+    <w:rPr>
+      <w:vertAlign w:val="superscript"/>
+    </w:rPr>
   </w:style>
   <w:style w:type="character" w:styleId="EndnoteReference">
     <w:name w:val="endnote reference"/>
     <w:rPr>
       <w:vertAlign w:val="superscript"/>
+    </w:rPr>
+  </w:style>
+  <w:style w:type="character" w:styleId="Hyperlink">
+    <w:name w:val="Hyperlink"/>
+    <w:rPr>
+      <w:color w:val="000080"/>
+      <w:u w:val="single"/>
     </w:rPr>
   </w:style>
   <w:style w:type="paragraph" w:styleId="Heading">

</xml_diff>